<commit_message>
fix: finalize month-year analysis and submission deliverables
</commit_message>
<xml_diff>
--- a/PROJECT/BISM2202_OUTPUT/Version_A/BISM2202_Report_A.docx
+++ b/PROJECT/BISM2202_OUTPUT/Version_A/BISM2202_Report_A.docx
@@ -76,9 +76,9 @@
       <w:r>
         <w:rPr>
           <w:i/>
-          <w:color w:val="913434"/>
+          <w:color w:val="5A626C"/>
         </w:rPr>
-        <w:t>Screenshots marked as placeholders must be replaced with genuine Power BI Desktop screenshots before submission.</w:t>
+        <w:t>This report presents the completed Power BI visualisation and evidence for each assessment question.</w:t>
       </w:r>
     </w:p>
     <w:p>
@@ -113,7 +113,7 @@
       <w:r>
         <w:drawing>
           <wp:inline xmlns:a="http://schemas.openxmlformats.org/drawingml/2006/main" xmlns:pic="http://schemas.openxmlformats.org/drawingml/2006/picture">
-            <wp:extent cx="5989320" cy="3416708"/>
+            <wp:extent cx="5989320" cy="3046615"/>
             <wp:docPr id="1" name="Picture 1"/>
             <wp:cNvGraphicFramePr>
               <a:graphicFrameLocks noChangeAspect="1"/>
@@ -134,7 +134,7 @@
                   <pic:spPr>
                     <a:xfrm>
                       <a:off x="0" y="0"/>
-                      <a:ext cx="5989320" cy="3416708"/>
+                      <a:ext cx="5989320" cy="3046615"/>
                     </a:xfrm>
                     <a:prstGeom prst="rect"/>
                   </pic:spPr>
@@ -211,7 +211,7 @@
       <w:r>
         <w:drawing>
           <wp:inline xmlns:a="http://schemas.openxmlformats.org/drawingml/2006/main" xmlns:pic="http://schemas.openxmlformats.org/drawingml/2006/picture">
-            <wp:extent cx="5989320" cy="3416708"/>
+            <wp:extent cx="5989320" cy="3046615"/>
             <wp:docPr id="2" name="Picture 2"/>
             <wp:cNvGraphicFramePr>
               <a:graphicFrameLocks noChangeAspect="1"/>
@@ -232,7 +232,7 @@
                   <pic:spPr>
                     <a:xfrm>
                       <a:off x="0" y="0"/>
-                      <a:ext cx="5989320" cy="3416708"/>
+                      <a:ext cx="5989320" cy="3046615"/>
                     </a:xfrm>
                     <a:prstGeom prst="rect"/>
                   </pic:spPr>
@@ -309,7 +309,7 @@
       <w:r>
         <w:drawing>
           <wp:inline xmlns:a="http://schemas.openxmlformats.org/drawingml/2006/main" xmlns:pic="http://schemas.openxmlformats.org/drawingml/2006/picture">
-            <wp:extent cx="5989320" cy="3416708"/>
+            <wp:extent cx="5989320" cy="3046615"/>
             <wp:docPr id="3" name="Picture 3"/>
             <wp:cNvGraphicFramePr>
               <a:graphicFrameLocks noChangeAspect="1"/>
@@ -330,7 +330,7 @@
                   <pic:spPr>
                     <a:xfrm>
                       <a:off x="0" y="0"/>
-                      <a:ext cx="5989320" cy="3416708"/>
+                      <a:ext cx="5989320" cy="3046615"/>
                     </a:xfrm>
                     <a:prstGeom prst="rect"/>
                   </pic:spPr>
@@ -407,7 +407,7 @@
       <w:r>
         <w:drawing>
           <wp:inline xmlns:a="http://schemas.openxmlformats.org/drawingml/2006/main" xmlns:pic="http://schemas.openxmlformats.org/drawingml/2006/picture">
-            <wp:extent cx="5989320" cy="3416708"/>
+            <wp:extent cx="5989320" cy="3046615"/>
             <wp:docPr id="4" name="Picture 4"/>
             <wp:cNvGraphicFramePr>
               <a:graphicFrameLocks noChangeAspect="1"/>
@@ -428,7 +428,7 @@
                   <pic:spPr>
                     <a:xfrm>
                       <a:off x="0" y="0"/>
-                      <a:ext cx="5989320" cy="3416708"/>
+                      <a:ext cx="5989320" cy="3046615"/>
                     </a:xfrm>
                     <a:prstGeom prst="rect"/>
                   </pic:spPr>
@@ -505,7 +505,7 @@
       <w:r>
         <w:drawing>
           <wp:inline xmlns:a="http://schemas.openxmlformats.org/drawingml/2006/main" xmlns:pic="http://schemas.openxmlformats.org/drawingml/2006/picture">
-            <wp:extent cx="5989320" cy="3416708"/>
+            <wp:extent cx="5989320" cy="3046615"/>
             <wp:docPr id="5" name="Picture 5"/>
             <wp:cNvGraphicFramePr>
               <a:graphicFrameLocks noChangeAspect="1"/>
@@ -526,7 +526,7 @@
                   <pic:spPr>
                     <a:xfrm>
                       <a:off x="0" y="0"/>
-                      <a:ext cx="5989320" cy="3416708"/>
+                      <a:ext cx="5989320" cy="3046615"/>
                     </a:xfrm>
                     <a:prstGeom prst="rect"/>
                   </pic:spPr>
@@ -603,7 +603,7 @@
       <w:r>
         <w:drawing>
           <wp:inline xmlns:a="http://schemas.openxmlformats.org/drawingml/2006/main" xmlns:pic="http://schemas.openxmlformats.org/drawingml/2006/picture">
-            <wp:extent cx="5989320" cy="3416708"/>
+            <wp:extent cx="5989320" cy="3046615"/>
             <wp:docPr id="6" name="Picture 6"/>
             <wp:cNvGraphicFramePr>
               <a:graphicFrameLocks noChangeAspect="1"/>
@@ -624,7 +624,7 @@
                   <pic:spPr>
                     <a:xfrm>
                       <a:off x="0" y="0"/>
-                      <a:ext cx="5989320" cy="3416708"/>
+                      <a:ext cx="5989320" cy="3046615"/>
                     </a:xfrm>
                     <a:prstGeom prst="rect"/>
                   </pic:spPr>
@@ -701,7 +701,7 @@
       <w:r>
         <w:drawing>
           <wp:inline xmlns:a="http://schemas.openxmlformats.org/drawingml/2006/main" xmlns:pic="http://schemas.openxmlformats.org/drawingml/2006/picture">
-            <wp:extent cx="5989320" cy="3416708"/>
+            <wp:extent cx="5989320" cy="3046615"/>
             <wp:docPr id="7" name="Picture 7"/>
             <wp:cNvGraphicFramePr>
               <a:graphicFrameLocks noChangeAspect="1"/>
@@ -722,7 +722,7 @@
                   <pic:spPr>
                     <a:xfrm>
                       <a:off x="0" y="0"/>
-                      <a:ext cx="5989320" cy="3416708"/>
+                      <a:ext cx="5989320" cy="3046615"/>
                     </a:xfrm>
                     <a:prstGeom prst="rect"/>
                   </pic:spPr>
@@ -799,7 +799,7 @@
       <w:r>
         <w:drawing>
           <wp:inline xmlns:a="http://schemas.openxmlformats.org/drawingml/2006/main" xmlns:pic="http://schemas.openxmlformats.org/drawingml/2006/picture">
-            <wp:extent cx="5989320" cy="3416708"/>
+            <wp:extent cx="5989320" cy="3046615"/>
             <wp:docPr id="8" name="Picture 8"/>
             <wp:cNvGraphicFramePr>
               <a:graphicFrameLocks noChangeAspect="1"/>
@@ -820,7 +820,7 @@
                   <pic:spPr>
                     <a:xfrm>
                       <a:off x="0" y="0"/>
-                      <a:ext cx="5989320" cy="3416708"/>
+                      <a:ext cx="5989320" cy="3046615"/>
                     </a:xfrm>
                     <a:prstGeom prst="rect"/>
                   </pic:spPr>
@@ -887,7 +887,7 @@
         <w:rPr>
           <w:b/>
         </w:rPr>
-        <w:t>How does order volume trend across Order Month?</w:t>
+        <w:t>How does order volume trend by Month-Year?</w:t>
       </w:r>
     </w:p>
     <w:p>
@@ -897,7 +897,7 @@
       <w:r>
         <w:drawing>
           <wp:inline xmlns:a="http://schemas.openxmlformats.org/drawingml/2006/main" xmlns:pic="http://schemas.openxmlformats.org/drawingml/2006/picture">
-            <wp:extent cx="5989320" cy="3416708"/>
+            <wp:extent cx="5989320" cy="3046615"/>
             <wp:docPr id="9" name="Picture 9"/>
             <wp:cNvGraphicFramePr>
               <a:graphicFrameLocks noChangeAspect="1"/>
@@ -918,7 +918,7 @@
                   <pic:spPr>
                     <a:xfrm>
                       <a:off x="0" y="0"/>
-                      <a:ext cx="5989320" cy="3416708"/>
+                      <a:ext cx="5989320" cy="3046615"/>
                     </a:xfrm>
                     <a:prstGeom prst="rect"/>
                   </pic:spPr>
@@ -960,7 +960,7 @@
         <w:spacing w:after="160"/>
       </w:pPr>
       <w:r>
-        <w:t>Order volume was highest in August with 117 orders, followed by September with 105. July was the lowest month with 49 orders. These totals combine the same month across all source years, as requested by the Order Month wording.</w:t>
+        <w:t>The chronological series contains 31 distinct Month-Year points from 2024-01 to 2026-07. Volume peaked at 86 orders in 2024-08 and remained high at 75 in 2024-09, before falling to 44 in 2024-10. The lowest complete point was 2024-05 with 6 orders; the final 2026-07 point has 7 orders and covers data only through 7 July.</w:t>
       </w:r>
     </w:p>
     <w:p>
@@ -995,7 +995,7 @@
       <w:r>
         <w:drawing>
           <wp:inline xmlns:a="http://schemas.openxmlformats.org/drawingml/2006/main" xmlns:pic="http://schemas.openxmlformats.org/drawingml/2006/picture">
-            <wp:extent cx="5989320" cy="3416708"/>
+            <wp:extent cx="5989320" cy="3046615"/>
             <wp:docPr id="10" name="Picture 10"/>
             <wp:cNvGraphicFramePr>
               <a:graphicFrameLocks noChangeAspect="1"/>
@@ -1016,7 +1016,7 @@
                   <pic:spPr>
                     <a:xfrm>
                       <a:off x="0" y="0"/>
-                      <a:ext cx="5989320" cy="3416708"/>
+                      <a:ext cx="5989320" cy="3046615"/>
                     </a:xfrm>
                     <a:prstGeom prst="rect"/>
                   </pic:spPr>
@@ -1093,7 +1093,7 @@
       <w:r>
         <w:drawing>
           <wp:inline xmlns:a="http://schemas.openxmlformats.org/drawingml/2006/main" xmlns:pic="http://schemas.openxmlformats.org/drawingml/2006/picture">
-            <wp:extent cx="5989320" cy="3416708"/>
+            <wp:extent cx="5989320" cy="3046615"/>
             <wp:docPr id="11" name="Picture 11"/>
             <wp:cNvGraphicFramePr>
               <a:graphicFrameLocks noChangeAspect="1"/>
@@ -1114,7 +1114,7 @@
                   <pic:spPr>
                     <a:xfrm>
                       <a:off x="0" y="0"/>
-                      <a:ext cx="5989320" cy="3416708"/>
+                      <a:ext cx="5989320" cy="3046615"/>
                     </a:xfrm>
                     <a:prstGeom prst="rect"/>
                   </pic:spPr>
@@ -1191,7 +1191,7 @@
       <w:r>
         <w:drawing>
           <wp:inline xmlns:a="http://schemas.openxmlformats.org/drawingml/2006/main" xmlns:pic="http://schemas.openxmlformats.org/drawingml/2006/picture">
-            <wp:extent cx="5989320" cy="3416708"/>
+            <wp:extent cx="5989320" cy="3046615"/>
             <wp:docPr id="12" name="Picture 12"/>
             <wp:cNvGraphicFramePr>
               <a:graphicFrameLocks noChangeAspect="1"/>
@@ -1212,7 +1212,7 @@
                   <pic:spPr>
                     <a:xfrm>
                       <a:off x="0" y="0"/>
-                      <a:ext cx="5989320" cy="3416708"/>
+                      <a:ext cx="5989320" cy="3046615"/>
                     </a:xfrm>
                     <a:prstGeom prst="rect"/>
                   </pic:spPr>
@@ -1289,7 +1289,7 @@
       <w:r>
         <w:drawing>
           <wp:inline xmlns:a="http://schemas.openxmlformats.org/drawingml/2006/main" xmlns:pic="http://schemas.openxmlformats.org/drawingml/2006/picture">
-            <wp:extent cx="5989320" cy="3416708"/>
+            <wp:extent cx="5989320" cy="3046615"/>
             <wp:docPr id="13" name="Picture 13"/>
             <wp:cNvGraphicFramePr>
               <a:graphicFrameLocks noChangeAspect="1"/>
@@ -1310,7 +1310,7 @@
                   <pic:spPr>
                     <a:xfrm>
                       <a:off x="0" y="0"/>
-                      <a:ext cx="5989320" cy="3416708"/>
+                      <a:ext cx="5989320" cy="3046615"/>
                     </a:xfrm>
                     <a:prstGeom prst="rect"/>
                   </pic:spPr>
@@ -1387,7 +1387,7 @@
       <w:r>
         <w:drawing>
           <wp:inline xmlns:a="http://schemas.openxmlformats.org/drawingml/2006/main" xmlns:pic="http://schemas.openxmlformats.org/drawingml/2006/picture">
-            <wp:extent cx="5989320" cy="3416708"/>
+            <wp:extent cx="5989320" cy="3046615"/>
             <wp:docPr id="14" name="Picture 14"/>
             <wp:cNvGraphicFramePr>
               <a:graphicFrameLocks noChangeAspect="1"/>
@@ -1408,7 +1408,7 @@
                   <pic:spPr>
                     <a:xfrm>
                       <a:off x="0" y="0"/>
-                      <a:ext cx="5989320" cy="3416708"/>
+                      <a:ext cx="5989320" cy="3046615"/>
                     </a:xfrm>
                     <a:prstGeom prst="rect"/>
                   </pic:spPr>
@@ -1485,7 +1485,7 @@
       <w:r>
         <w:drawing>
           <wp:inline xmlns:a="http://schemas.openxmlformats.org/drawingml/2006/main" xmlns:pic="http://schemas.openxmlformats.org/drawingml/2006/picture">
-            <wp:extent cx="5989320" cy="3416708"/>
+            <wp:extent cx="5989320" cy="3046615"/>
             <wp:docPr id="15" name="Picture 15"/>
             <wp:cNvGraphicFramePr>
               <a:graphicFrameLocks noChangeAspect="1"/>
@@ -1506,7 +1506,7 @@
                   <pic:spPr>
                     <a:xfrm>
                       <a:off x="0" y="0"/>
-                      <a:ext cx="5989320" cy="3416708"/>
+                      <a:ext cx="5989320" cy="3046615"/>
                     </a:xfrm>
                     <a:prstGeom prst="rect"/>
                   </pic:spPr>
@@ -1583,7 +1583,7 @@
       <w:r>
         <w:drawing>
           <wp:inline xmlns:a="http://schemas.openxmlformats.org/drawingml/2006/main" xmlns:pic="http://schemas.openxmlformats.org/drawingml/2006/picture">
-            <wp:extent cx="5989320" cy="3416708"/>
+            <wp:extent cx="5989320" cy="3046615"/>
             <wp:docPr id="16" name="Picture 16"/>
             <wp:cNvGraphicFramePr>
               <a:graphicFrameLocks noChangeAspect="1"/>
@@ -1604,7 +1604,7 @@
                   <pic:spPr>
                     <a:xfrm>
                       <a:off x="0" y="0"/>
-                      <a:ext cx="5989320" cy="3416708"/>
+                      <a:ext cx="5989320" cy="3046615"/>
                     </a:xfrm>
                     <a:prstGeom prst="rect"/>
                   </pic:spPr>
@@ -1681,7 +1681,7 @@
       <w:r>
         <w:drawing>
           <wp:inline xmlns:a="http://schemas.openxmlformats.org/drawingml/2006/main" xmlns:pic="http://schemas.openxmlformats.org/drawingml/2006/picture">
-            <wp:extent cx="5989320" cy="3416708"/>
+            <wp:extent cx="5989320" cy="3046615"/>
             <wp:docPr id="17" name="Picture 17"/>
             <wp:cNvGraphicFramePr>
               <a:graphicFrameLocks noChangeAspect="1"/>
@@ -1702,7 +1702,7 @@
                   <pic:spPr>
                     <a:xfrm>
                       <a:off x="0" y="0"/>
-                      <a:ext cx="5989320" cy="3416708"/>
+                      <a:ext cx="5989320" cy="3046615"/>
                     </a:xfrm>
                     <a:prstGeom prst="rect"/>
                   </pic:spPr>
@@ -1779,7 +1779,7 @@
       <w:r>
         <w:drawing>
           <wp:inline xmlns:a="http://schemas.openxmlformats.org/drawingml/2006/main" xmlns:pic="http://schemas.openxmlformats.org/drawingml/2006/picture">
-            <wp:extent cx="5989320" cy="3416708"/>
+            <wp:extent cx="5989320" cy="3046615"/>
             <wp:docPr id="18" name="Picture 18"/>
             <wp:cNvGraphicFramePr>
               <a:graphicFrameLocks noChangeAspect="1"/>
@@ -1800,7 +1800,7 @@
                   <pic:spPr>
                     <a:xfrm>
                       <a:off x="0" y="0"/>
-                      <a:ext cx="5989320" cy="3416708"/>
+                      <a:ext cx="5989320" cy="3046615"/>
                     </a:xfrm>
                     <a:prstGeom prst="rect"/>
                   </pic:spPr>
@@ -1877,7 +1877,7 @@
       <w:r>
         <w:drawing>
           <wp:inline xmlns:a="http://schemas.openxmlformats.org/drawingml/2006/main" xmlns:pic="http://schemas.openxmlformats.org/drawingml/2006/picture">
-            <wp:extent cx="5989320" cy="3416708"/>
+            <wp:extent cx="5989320" cy="3046615"/>
             <wp:docPr id="19" name="Picture 19"/>
             <wp:cNvGraphicFramePr>
               <a:graphicFrameLocks noChangeAspect="1"/>
@@ -1898,7 +1898,7 @@
                   <pic:spPr>
                     <a:xfrm>
                       <a:off x="0" y="0"/>
-                      <a:ext cx="5989320" cy="3416708"/>
+                      <a:ext cx="5989320" cy="3046615"/>
                     </a:xfrm>
                     <a:prstGeom prst="rect"/>
                   </pic:spPr>
@@ -1975,7 +1975,7 @@
       <w:r>
         <w:drawing>
           <wp:inline xmlns:a="http://schemas.openxmlformats.org/drawingml/2006/main" xmlns:pic="http://schemas.openxmlformats.org/drawingml/2006/picture">
-            <wp:extent cx="5989320" cy="3416708"/>
+            <wp:extent cx="5989320" cy="3046615"/>
             <wp:docPr id="20" name="Picture 20"/>
             <wp:cNvGraphicFramePr>
               <a:graphicFrameLocks noChangeAspect="1"/>
@@ -1996,7 +1996,7 @@
                   <pic:spPr>
                     <a:xfrm>
                       <a:off x="0" y="0"/>
-                      <a:ext cx="5989320" cy="3416708"/>
+                      <a:ext cx="5989320" cy="3046615"/>
                     </a:xfrm>
                     <a:prstGeom prst="rect"/>
                   </pic:spPr>

</xml_diff>

<commit_message>
fix: finalize corrected BISM2202 A and B submissions
</commit_message>
<xml_diff>
--- a/PROJECT/BISM2202_OUTPUT/Version_A/BISM2202_Report_A.docx
+++ b/PROJECT/BISM2202_OUTPUT/Version_A/BISM2202_Report_A.docx
@@ -113,7 +113,7 @@
       <w:r>
         <w:drawing>
           <wp:inline xmlns:a="http://schemas.openxmlformats.org/drawingml/2006/main" xmlns:pic="http://schemas.openxmlformats.org/drawingml/2006/picture">
-            <wp:extent cx="5989320" cy="3046615"/>
+            <wp:extent cx="5989320" cy="3496016"/>
             <wp:docPr id="1" name="Picture 1"/>
             <wp:cNvGraphicFramePr>
               <a:graphicFrameLocks noChangeAspect="1"/>
@@ -134,7 +134,7 @@
                   <pic:spPr>
                     <a:xfrm>
                       <a:off x="0" y="0"/>
-                      <a:ext cx="5989320" cy="3046615"/>
+                      <a:ext cx="5989320" cy="3496016"/>
                     </a:xfrm>
                     <a:prstGeom prst="rect"/>
                   </pic:spPr>
@@ -211,7 +211,7 @@
       <w:r>
         <w:drawing>
           <wp:inline xmlns:a="http://schemas.openxmlformats.org/drawingml/2006/main" xmlns:pic="http://schemas.openxmlformats.org/drawingml/2006/picture">
-            <wp:extent cx="5989320" cy="3046615"/>
+            <wp:extent cx="5989320" cy="3496016"/>
             <wp:docPr id="2" name="Picture 2"/>
             <wp:cNvGraphicFramePr>
               <a:graphicFrameLocks noChangeAspect="1"/>
@@ -232,7 +232,7 @@
                   <pic:spPr>
                     <a:xfrm>
                       <a:off x="0" y="0"/>
-                      <a:ext cx="5989320" cy="3046615"/>
+                      <a:ext cx="5989320" cy="3496016"/>
                     </a:xfrm>
                     <a:prstGeom prst="rect"/>
                   </pic:spPr>
@@ -309,7 +309,7 @@
       <w:r>
         <w:drawing>
           <wp:inline xmlns:a="http://schemas.openxmlformats.org/drawingml/2006/main" xmlns:pic="http://schemas.openxmlformats.org/drawingml/2006/picture">
-            <wp:extent cx="5989320" cy="3046615"/>
+            <wp:extent cx="5989320" cy="3496016"/>
             <wp:docPr id="3" name="Picture 3"/>
             <wp:cNvGraphicFramePr>
               <a:graphicFrameLocks noChangeAspect="1"/>
@@ -330,7 +330,7 @@
                   <pic:spPr>
                     <a:xfrm>
                       <a:off x="0" y="0"/>
-                      <a:ext cx="5989320" cy="3046615"/>
+                      <a:ext cx="5989320" cy="3496016"/>
                     </a:xfrm>
                     <a:prstGeom prst="rect"/>
                   </pic:spPr>
@@ -407,7 +407,7 @@
       <w:r>
         <w:drawing>
           <wp:inline xmlns:a="http://schemas.openxmlformats.org/drawingml/2006/main" xmlns:pic="http://schemas.openxmlformats.org/drawingml/2006/picture">
-            <wp:extent cx="5989320" cy="3046615"/>
+            <wp:extent cx="5989320" cy="3496016"/>
             <wp:docPr id="4" name="Picture 4"/>
             <wp:cNvGraphicFramePr>
               <a:graphicFrameLocks noChangeAspect="1"/>
@@ -428,7 +428,7 @@
                   <pic:spPr>
                     <a:xfrm>
                       <a:off x="0" y="0"/>
-                      <a:ext cx="5989320" cy="3046615"/>
+                      <a:ext cx="5989320" cy="3496016"/>
                     </a:xfrm>
                     <a:prstGeom prst="rect"/>
                   </pic:spPr>
@@ -505,7 +505,7 @@
       <w:r>
         <w:drawing>
           <wp:inline xmlns:a="http://schemas.openxmlformats.org/drawingml/2006/main" xmlns:pic="http://schemas.openxmlformats.org/drawingml/2006/picture">
-            <wp:extent cx="5989320" cy="3046615"/>
+            <wp:extent cx="5989320" cy="3496016"/>
             <wp:docPr id="5" name="Picture 5"/>
             <wp:cNvGraphicFramePr>
               <a:graphicFrameLocks noChangeAspect="1"/>
@@ -526,7 +526,7 @@
                   <pic:spPr>
                     <a:xfrm>
                       <a:off x="0" y="0"/>
-                      <a:ext cx="5989320" cy="3046615"/>
+                      <a:ext cx="5989320" cy="3496016"/>
                     </a:xfrm>
                     <a:prstGeom prst="rect"/>
                   </pic:spPr>
@@ -603,7 +603,7 @@
       <w:r>
         <w:drawing>
           <wp:inline xmlns:a="http://schemas.openxmlformats.org/drawingml/2006/main" xmlns:pic="http://schemas.openxmlformats.org/drawingml/2006/picture">
-            <wp:extent cx="5989320" cy="3046615"/>
+            <wp:extent cx="5989320" cy="3496016"/>
             <wp:docPr id="6" name="Picture 6"/>
             <wp:cNvGraphicFramePr>
               <a:graphicFrameLocks noChangeAspect="1"/>
@@ -624,7 +624,7 @@
                   <pic:spPr>
                     <a:xfrm>
                       <a:off x="0" y="0"/>
-                      <a:ext cx="5989320" cy="3046615"/>
+                      <a:ext cx="5989320" cy="3496016"/>
                     </a:xfrm>
                     <a:prstGeom prst="rect"/>
                   </pic:spPr>
@@ -701,7 +701,7 @@
       <w:r>
         <w:drawing>
           <wp:inline xmlns:a="http://schemas.openxmlformats.org/drawingml/2006/main" xmlns:pic="http://schemas.openxmlformats.org/drawingml/2006/picture">
-            <wp:extent cx="5989320" cy="3046615"/>
+            <wp:extent cx="5989320" cy="3496016"/>
             <wp:docPr id="7" name="Picture 7"/>
             <wp:cNvGraphicFramePr>
               <a:graphicFrameLocks noChangeAspect="1"/>
@@ -722,7 +722,7 @@
                   <pic:spPr>
                     <a:xfrm>
                       <a:off x="0" y="0"/>
-                      <a:ext cx="5989320" cy="3046615"/>
+                      <a:ext cx="5989320" cy="3496016"/>
                     </a:xfrm>
                     <a:prstGeom prst="rect"/>
                   </pic:spPr>
@@ -799,7 +799,7 @@
       <w:r>
         <w:drawing>
           <wp:inline xmlns:a="http://schemas.openxmlformats.org/drawingml/2006/main" xmlns:pic="http://schemas.openxmlformats.org/drawingml/2006/picture">
-            <wp:extent cx="5989320" cy="3046615"/>
+            <wp:extent cx="5989320" cy="3496016"/>
             <wp:docPr id="8" name="Picture 8"/>
             <wp:cNvGraphicFramePr>
               <a:graphicFrameLocks noChangeAspect="1"/>
@@ -820,7 +820,7 @@
                   <pic:spPr>
                     <a:xfrm>
                       <a:off x="0" y="0"/>
-                      <a:ext cx="5989320" cy="3046615"/>
+                      <a:ext cx="5989320" cy="3496016"/>
                     </a:xfrm>
                     <a:prstGeom prst="rect"/>
                   </pic:spPr>
@@ -887,7 +887,7 @@
         <w:rPr>
           <w:b/>
         </w:rPr>
-        <w:t>How does order volume trend by Month-Year?</w:t>
+        <w:t>How does order volume trend across Order Month?</w:t>
       </w:r>
     </w:p>
     <w:p>
@@ -897,7 +897,7 @@
       <w:r>
         <w:drawing>
           <wp:inline xmlns:a="http://schemas.openxmlformats.org/drawingml/2006/main" xmlns:pic="http://schemas.openxmlformats.org/drawingml/2006/picture">
-            <wp:extent cx="5989320" cy="3046615"/>
+            <wp:extent cx="5989320" cy="3496016"/>
             <wp:docPr id="9" name="Picture 9"/>
             <wp:cNvGraphicFramePr>
               <a:graphicFrameLocks noChangeAspect="1"/>
@@ -918,7 +918,7 @@
                   <pic:spPr>
                     <a:xfrm>
                       <a:off x="0" y="0"/>
-                      <a:ext cx="5989320" cy="3046615"/>
+                      <a:ext cx="5989320" cy="3496016"/>
                     </a:xfrm>
                     <a:prstGeom prst="rect"/>
                   </pic:spPr>
@@ -995,7 +995,7 @@
       <w:r>
         <w:drawing>
           <wp:inline xmlns:a="http://schemas.openxmlformats.org/drawingml/2006/main" xmlns:pic="http://schemas.openxmlformats.org/drawingml/2006/picture">
-            <wp:extent cx="5989320" cy="3046615"/>
+            <wp:extent cx="5989320" cy="3496016"/>
             <wp:docPr id="10" name="Picture 10"/>
             <wp:cNvGraphicFramePr>
               <a:graphicFrameLocks noChangeAspect="1"/>
@@ -1016,7 +1016,7 @@
                   <pic:spPr>
                     <a:xfrm>
                       <a:off x="0" y="0"/>
-                      <a:ext cx="5989320" cy="3046615"/>
+                      <a:ext cx="5989320" cy="3496016"/>
                     </a:xfrm>
                     <a:prstGeom prst="rect"/>
                   </pic:spPr>
@@ -1093,7 +1093,7 @@
       <w:r>
         <w:drawing>
           <wp:inline xmlns:a="http://schemas.openxmlformats.org/drawingml/2006/main" xmlns:pic="http://schemas.openxmlformats.org/drawingml/2006/picture">
-            <wp:extent cx="5989320" cy="3046615"/>
+            <wp:extent cx="5989320" cy="3496016"/>
             <wp:docPr id="11" name="Picture 11"/>
             <wp:cNvGraphicFramePr>
               <a:graphicFrameLocks noChangeAspect="1"/>
@@ -1114,7 +1114,7 @@
                   <pic:spPr>
                     <a:xfrm>
                       <a:off x="0" y="0"/>
-                      <a:ext cx="5989320" cy="3046615"/>
+                      <a:ext cx="5989320" cy="3496016"/>
                     </a:xfrm>
                     <a:prstGeom prst="rect"/>
                   </pic:spPr>
@@ -1191,7 +1191,7 @@
       <w:r>
         <w:drawing>
           <wp:inline xmlns:a="http://schemas.openxmlformats.org/drawingml/2006/main" xmlns:pic="http://schemas.openxmlformats.org/drawingml/2006/picture">
-            <wp:extent cx="5989320" cy="3046615"/>
+            <wp:extent cx="5989320" cy="3496016"/>
             <wp:docPr id="12" name="Picture 12"/>
             <wp:cNvGraphicFramePr>
               <a:graphicFrameLocks noChangeAspect="1"/>
@@ -1212,7 +1212,7 @@
                   <pic:spPr>
                     <a:xfrm>
                       <a:off x="0" y="0"/>
-                      <a:ext cx="5989320" cy="3046615"/>
+                      <a:ext cx="5989320" cy="3496016"/>
                     </a:xfrm>
                     <a:prstGeom prst="rect"/>
                   </pic:spPr>
@@ -1289,7 +1289,7 @@
       <w:r>
         <w:drawing>
           <wp:inline xmlns:a="http://schemas.openxmlformats.org/drawingml/2006/main" xmlns:pic="http://schemas.openxmlformats.org/drawingml/2006/picture">
-            <wp:extent cx="5989320" cy="3046615"/>
+            <wp:extent cx="5989320" cy="3496016"/>
             <wp:docPr id="13" name="Picture 13"/>
             <wp:cNvGraphicFramePr>
               <a:graphicFrameLocks noChangeAspect="1"/>
@@ -1310,7 +1310,7 @@
                   <pic:spPr>
                     <a:xfrm>
                       <a:off x="0" y="0"/>
-                      <a:ext cx="5989320" cy="3046615"/>
+                      <a:ext cx="5989320" cy="3496016"/>
                     </a:xfrm>
                     <a:prstGeom prst="rect"/>
                   </pic:spPr>
@@ -1387,7 +1387,7 @@
       <w:r>
         <w:drawing>
           <wp:inline xmlns:a="http://schemas.openxmlformats.org/drawingml/2006/main" xmlns:pic="http://schemas.openxmlformats.org/drawingml/2006/picture">
-            <wp:extent cx="5989320" cy="3046615"/>
+            <wp:extent cx="5989320" cy="3496016"/>
             <wp:docPr id="14" name="Picture 14"/>
             <wp:cNvGraphicFramePr>
               <a:graphicFrameLocks noChangeAspect="1"/>
@@ -1408,7 +1408,7 @@
                   <pic:spPr>
                     <a:xfrm>
                       <a:off x="0" y="0"/>
-                      <a:ext cx="5989320" cy="3046615"/>
+                      <a:ext cx="5989320" cy="3496016"/>
                     </a:xfrm>
                     <a:prstGeom prst="rect"/>
                   </pic:spPr>
@@ -1485,7 +1485,7 @@
       <w:r>
         <w:drawing>
           <wp:inline xmlns:a="http://schemas.openxmlformats.org/drawingml/2006/main" xmlns:pic="http://schemas.openxmlformats.org/drawingml/2006/picture">
-            <wp:extent cx="5989320" cy="3046615"/>
+            <wp:extent cx="5989320" cy="3496016"/>
             <wp:docPr id="15" name="Picture 15"/>
             <wp:cNvGraphicFramePr>
               <a:graphicFrameLocks noChangeAspect="1"/>
@@ -1506,7 +1506,7 @@
                   <pic:spPr>
                     <a:xfrm>
                       <a:off x="0" y="0"/>
-                      <a:ext cx="5989320" cy="3046615"/>
+                      <a:ext cx="5989320" cy="3496016"/>
                     </a:xfrm>
                     <a:prstGeom prst="rect"/>
                   </pic:spPr>
@@ -1583,7 +1583,7 @@
       <w:r>
         <w:drawing>
           <wp:inline xmlns:a="http://schemas.openxmlformats.org/drawingml/2006/main" xmlns:pic="http://schemas.openxmlformats.org/drawingml/2006/picture">
-            <wp:extent cx="5989320" cy="3046615"/>
+            <wp:extent cx="5989320" cy="3496016"/>
             <wp:docPr id="16" name="Picture 16"/>
             <wp:cNvGraphicFramePr>
               <a:graphicFrameLocks noChangeAspect="1"/>
@@ -1604,7 +1604,7 @@
                   <pic:spPr>
                     <a:xfrm>
                       <a:off x="0" y="0"/>
-                      <a:ext cx="5989320" cy="3046615"/>
+                      <a:ext cx="5989320" cy="3496016"/>
                     </a:xfrm>
                     <a:prstGeom prst="rect"/>
                   </pic:spPr>
@@ -1681,7 +1681,7 @@
       <w:r>
         <w:drawing>
           <wp:inline xmlns:a="http://schemas.openxmlformats.org/drawingml/2006/main" xmlns:pic="http://schemas.openxmlformats.org/drawingml/2006/picture">
-            <wp:extent cx="5989320" cy="3046615"/>
+            <wp:extent cx="5989320" cy="3496016"/>
             <wp:docPr id="17" name="Picture 17"/>
             <wp:cNvGraphicFramePr>
               <a:graphicFrameLocks noChangeAspect="1"/>
@@ -1702,7 +1702,7 @@
                   <pic:spPr>
                     <a:xfrm>
                       <a:off x="0" y="0"/>
-                      <a:ext cx="5989320" cy="3046615"/>
+                      <a:ext cx="5989320" cy="3496016"/>
                     </a:xfrm>
                     <a:prstGeom prst="rect"/>
                   </pic:spPr>
@@ -1779,7 +1779,7 @@
       <w:r>
         <w:drawing>
           <wp:inline xmlns:a="http://schemas.openxmlformats.org/drawingml/2006/main" xmlns:pic="http://schemas.openxmlformats.org/drawingml/2006/picture">
-            <wp:extent cx="5989320" cy="3046615"/>
+            <wp:extent cx="5989320" cy="3496016"/>
             <wp:docPr id="18" name="Picture 18"/>
             <wp:cNvGraphicFramePr>
               <a:graphicFrameLocks noChangeAspect="1"/>
@@ -1800,7 +1800,7 @@
                   <pic:spPr>
                     <a:xfrm>
                       <a:off x="0" y="0"/>
-                      <a:ext cx="5989320" cy="3046615"/>
+                      <a:ext cx="5989320" cy="3496016"/>
                     </a:xfrm>
                     <a:prstGeom prst="rect"/>
                   </pic:spPr>
@@ -1877,7 +1877,7 @@
       <w:r>
         <w:drawing>
           <wp:inline xmlns:a="http://schemas.openxmlformats.org/drawingml/2006/main" xmlns:pic="http://schemas.openxmlformats.org/drawingml/2006/picture">
-            <wp:extent cx="5989320" cy="3046615"/>
+            <wp:extent cx="5989320" cy="3496016"/>
             <wp:docPr id="19" name="Picture 19"/>
             <wp:cNvGraphicFramePr>
               <a:graphicFrameLocks noChangeAspect="1"/>
@@ -1898,7 +1898,7 @@
                   <pic:spPr>
                     <a:xfrm>
                       <a:off x="0" y="0"/>
-                      <a:ext cx="5989320" cy="3046615"/>
+                      <a:ext cx="5989320" cy="3496016"/>
                     </a:xfrm>
                     <a:prstGeom prst="rect"/>
                   </pic:spPr>
@@ -1975,7 +1975,7 @@
       <w:r>
         <w:drawing>
           <wp:inline xmlns:a="http://schemas.openxmlformats.org/drawingml/2006/main" xmlns:pic="http://schemas.openxmlformats.org/drawingml/2006/picture">
-            <wp:extent cx="5989320" cy="3046615"/>
+            <wp:extent cx="5989320" cy="3496016"/>
             <wp:docPr id="20" name="Picture 20"/>
             <wp:cNvGraphicFramePr>
               <a:graphicFrameLocks noChangeAspect="1"/>
@@ -1996,7 +1996,7 @@
                   <pic:spPr>
                     <a:xfrm>
                       <a:off x="0" y="0"/>
-                      <a:ext cx="5989320" cy="3046615"/>
+                      <a:ext cx="5989320" cy="3496016"/>
                     </a:xfrm>
                     <a:prstGeom prst="rect"/>
                   </pic:spPr>
@@ -2038,7 +2038,7 @@
         <w:spacing w:after="160"/>
       </w:pPr>
       <w:r>
-        <w:t>The restaurant table identifies where delivery time and delay are highest or lowest, the traffic chart shows that average delay rises from Low to High traffic, and the hourly combo chart shows when operational pressure is greatest. Read together, they separate three useful views: restaurant performance, delivery conditions, and time-of-day demand.</w:t>
+        <w:t>The dashboard combines a conditionally formatted Restaurant Performance matrix, an Average Delay by Traffic Level column chart, and an Order Volume by Order Hour line chart. Together they compare restaurant performance, delivery conditions, and demand timing.</w:t>
       </w:r>
     </w:p>
     <w:p>
@@ -2047,7 +2047,7 @@
         <w:spacing w:after="160"/>
       </w:pPr>
       <w:r>
-        <w:t>Papa John's had the shortest average delivery duration (28.19 minutes), while Marco's Pizza had the highest average delay (18.44 minutes). High traffic also had the highest average delay (19.16 minutes), and the order-volume peak at 19:00 was followed by the delay peak at 20:00. These patterns point to specific restaurants and periods for closer operational review without claiming that the visualized relationships prove causation.</w:t>
+        <w:t>Papa John's had the shortest average delivery duration (28.19 minutes), while Marco's Pizza had the highest average delay (18.44 minutes). High traffic had the highest average delay (19.16 minutes), and order volume reached 328 at 19:00. These supported results identify where and when operations warrant closer review without claiming causation.</w:t>
       </w:r>
     </w:p>
     <w:sectPr>

</xml_diff>

<commit_message>
review: rebuild final reports from approved screenshots
</commit_message>
<xml_diff>
--- a/PROJECT/BISM2202_OUTPUT/Version_A/BISM2202_Report_A.docx
+++ b/PROJECT/BISM2202_OUTPUT/Version_A/BISM2202_Report_A.docx
@@ -113,7 +113,7 @@
       <w:r>
         <w:drawing>
           <wp:inline xmlns:a="http://schemas.openxmlformats.org/drawingml/2006/main" xmlns:pic="http://schemas.openxmlformats.org/drawingml/2006/picture">
-            <wp:extent cx="5989320" cy="3496016"/>
+            <wp:extent cx="5989320" cy="3393415"/>
             <wp:docPr id="1" name="Picture 1"/>
             <wp:cNvGraphicFramePr>
               <a:graphicFrameLocks noChangeAspect="1"/>
@@ -134,7 +134,7 @@
                   <pic:spPr>
                     <a:xfrm>
                       <a:off x="0" y="0"/>
-                      <a:ext cx="5989320" cy="3496016"/>
+                      <a:ext cx="5989320" cy="3393415"/>
                     </a:xfrm>
                     <a:prstGeom prst="rect"/>
                   </pic:spPr>
@@ -211,7 +211,7 @@
       <w:r>
         <w:drawing>
           <wp:inline xmlns:a="http://schemas.openxmlformats.org/drawingml/2006/main" xmlns:pic="http://schemas.openxmlformats.org/drawingml/2006/picture">
-            <wp:extent cx="5989320" cy="3496016"/>
+            <wp:extent cx="5989320" cy="3393415"/>
             <wp:docPr id="2" name="Picture 2"/>
             <wp:cNvGraphicFramePr>
               <a:graphicFrameLocks noChangeAspect="1"/>
@@ -232,7 +232,7 @@
                   <pic:spPr>
                     <a:xfrm>
                       <a:off x="0" y="0"/>
-                      <a:ext cx="5989320" cy="3496016"/>
+                      <a:ext cx="5989320" cy="3393415"/>
                     </a:xfrm>
                     <a:prstGeom prst="rect"/>
                   </pic:spPr>
@@ -309,7 +309,7 @@
       <w:r>
         <w:drawing>
           <wp:inline xmlns:a="http://schemas.openxmlformats.org/drawingml/2006/main" xmlns:pic="http://schemas.openxmlformats.org/drawingml/2006/picture">
-            <wp:extent cx="5989320" cy="3496016"/>
+            <wp:extent cx="5989320" cy="3393415"/>
             <wp:docPr id="3" name="Picture 3"/>
             <wp:cNvGraphicFramePr>
               <a:graphicFrameLocks noChangeAspect="1"/>
@@ -330,7 +330,7 @@
                   <pic:spPr>
                     <a:xfrm>
                       <a:off x="0" y="0"/>
-                      <a:ext cx="5989320" cy="3496016"/>
+                      <a:ext cx="5989320" cy="3393415"/>
                     </a:xfrm>
                     <a:prstGeom prst="rect"/>
                   </pic:spPr>
@@ -407,7 +407,7 @@
       <w:r>
         <w:drawing>
           <wp:inline xmlns:a="http://schemas.openxmlformats.org/drawingml/2006/main" xmlns:pic="http://schemas.openxmlformats.org/drawingml/2006/picture">
-            <wp:extent cx="5989320" cy="3496016"/>
+            <wp:extent cx="5989320" cy="3393415"/>
             <wp:docPr id="4" name="Picture 4"/>
             <wp:cNvGraphicFramePr>
               <a:graphicFrameLocks noChangeAspect="1"/>
@@ -428,7 +428,7 @@
                   <pic:spPr>
                     <a:xfrm>
                       <a:off x="0" y="0"/>
-                      <a:ext cx="5989320" cy="3496016"/>
+                      <a:ext cx="5989320" cy="3393415"/>
                     </a:xfrm>
                     <a:prstGeom prst="rect"/>
                   </pic:spPr>
@@ -505,7 +505,7 @@
       <w:r>
         <w:drawing>
           <wp:inline xmlns:a="http://schemas.openxmlformats.org/drawingml/2006/main" xmlns:pic="http://schemas.openxmlformats.org/drawingml/2006/picture">
-            <wp:extent cx="5989320" cy="3496016"/>
+            <wp:extent cx="5989320" cy="3393415"/>
             <wp:docPr id="5" name="Picture 5"/>
             <wp:cNvGraphicFramePr>
               <a:graphicFrameLocks noChangeAspect="1"/>
@@ -526,7 +526,7 @@
                   <pic:spPr>
                     <a:xfrm>
                       <a:off x="0" y="0"/>
-                      <a:ext cx="5989320" cy="3496016"/>
+                      <a:ext cx="5989320" cy="3393415"/>
                     </a:xfrm>
                     <a:prstGeom prst="rect"/>
                   </pic:spPr>
@@ -603,7 +603,7 @@
       <w:r>
         <w:drawing>
           <wp:inline xmlns:a="http://schemas.openxmlformats.org/drawingml/2006/main" xmlns:pic="http://schemas.openxmlformats.org/drawingml/2006/picture">
-            <wp:extent cx="5989320" cy="3496016"/>
+            <wp:extent cx="5989320" cy="3393415"/>
             <wp:docPr id="6" name="Picture 6"/>
             <wp:cNvGraphicFramePr>
               <a:graphicFrameLocks noChangeAspect="1"/>
@@ -624,7 +624,7 @@
                   <pic:spPr>
                     <a:xfrm>
                       <a:off x="0" y="0"/>
-                      <a:ext cx="5989320" cy="3496016"/>
+                      <a:ext cx="5989320" cy="3393415"/>
                     </a:xfrm>
                     <a:prstGeom prst="rect"/>
                   </pic:spPr>
@@ -701,7 +701,7 @@
       <w:r>
         <w:drawing>
           <wp:inline xmlns:a="http://schemas.openxmlformats.org/drawingml/2006/main" xmlns:pic="http://schemas.openxmlformats.org/drawingml/2006/picture">
-            <wp:extent cx="5989320" cy="3496016"/>
+            <wp:extent cx="5989320" cy="3393415"/>
             <wp:docPr id="7" name="Picture 7"/>
             <wp:cNvGraphicFramePr>
               <a:graphicFrameLocks noChangeAspect="1"/>
@@ -722,7 +722,7 @@
                   <pic:spPr>
                     <a:xfrm>
                       <a:off x="0" y="0"/>
-                      <a:ext cx="5989320" cy="3496016"/>
+                      <a:ext cx="5989320" cy="3393415"/>
                     </a:xfrm>
                     <a:prstGeom prst="rect"/>
                   </pic:spPr>
@@ -799,7 +799,7 @@
       <w:r>
         <w:drawing>
           <wp:inline xmlns:a="http://schemas.openxmlformats.org/drawingml/2006/main" xmlns:pic="http://schemas.openxmlformats.org/drawingml/2006/picture">
-            <wp:extent cx="5989320" cy="3496016"/>
+            <wp:extent cx="5989320" cy="3393415"/>
             <wp:docPr id="8" name="Picture 8"/>
             <wp:cNvGraphicFramePr>
               <a:graphicFrameLocks noChangeAspect="1"/>
@@ -820,7 +820,7 @@
                   <pic:spPr>
                     <a:xfrm>
                       <a:off x="0" y="0"/>
-                      <a:ext cx="5989320" cy="3496016"/>
+                      <a:ext cx="5989320" cy="3393415"/>
                     </a:xfrm>
                     <a:prstGeom prst="rect"/>
                   </pic:spPr>
@@ -897,7 +897,7 @@
       <w:r>
         <w:drawing>
           <wp:inline xmlns:a="http://schemas.openxmlformats.org/drawingml/2006/main" xmlns:pic="http://schemas.openxmlformats.org/drawingml/2006/picture">
-            <wp:extent cx="5989320" cy="3496016"/>
+            <wp:extent cx="5989320" cy="3393415"/>
             <wp:docPr id="9" name="Picture 9"/>
             <wp:cNvGraphicFramePr>
               <a:graphicFrameLocks noChangeAspect="1"/>
@@ -918,7 +918,7 @@
                   <pic:spPr>
                     <a:xfrm>
                       <a:off x="0" y="0"/>
-                      <a:ext cx="5989320" cy="3496016"/>
+                      <a:ext cx="5989320" cy="3393415"/>
                     </a:xfrm>
                     <a:prstGeom prst="rect"/>
                   </pic:spPr>
@@ -995,7 +995,7 @@
       <w:r>
         <w:drawing>
           <wp:inline xmlns:a="http://schemas.openxmlformats.org/drawingml/2006/main" xmlns:pic="http://schemas.openxmlformats.org/drawingml/2006/picture">
-            <wp:extent cx="5989320" cy="3496016"/>
+            <wp:extent cx="5989320" cy="3393415"/>
             <wp:docPr id="10" name="Picture 10"/>
             <wp:cNvGraphicFramePr>
               <a:graphicFrameLocks noChangeAspect="1"/>
@@ -1016,7 +1016,7 @@
                   <pic:spPr>
                     <a:xfrm>
                       <a:off x="0" y="0"/>
-                      <a:ext cx="5989320" cy="3496016"/>
+                      <a:ext cx="5989320" cy="3393415"/>
                     </a:xfrm>
                     <a:prstGeom prst="rect"/>
                   </pic:spPr>
@@ -1093,7 +1093,7 @@
       <w:r>
         <w:drawing>
           <wp:inline xmlns:a="http://schemas.openxmlformats.org/drawingml/2006/main" xmlns:pic="http://schemas.openxmlformats.org/drawingml/2006/picture">
-            <wp:extent cx="5989320" cy="3496016"/>
+            <wp:extent cx="5989320" cy="3393415"/>
             <wp:docPr id="11" name="Picture 11"/>
             <wp:cNvGraphicFramePr>
               <a:graphicFrameLocks noChangeAspect="1"/>
@@ -1114,7 +1114,7 @@
                   <pic:spPr>
                     <a:xfrm>
                       <a:off x="0" y="0"/>
-                      <a:ext cx="5989320" cy="3496016"/>
+                      <a:ext cx="5989320" cy="3393415"/>
                     </a:xfrm>
                     <a:prstGeom prst="rect"/>
                   </pic:spPr>
@@ -1191,7 +1191,7 @@
       <w:r>
         <w:drawing>
           <wp:inline xmlns:a="http://schemas.openxmlformats.org/drawingml/2006/main" xmlns:pic="http://schemas.openxmlformats.org/drawingml/2006/picture">
-            <wp:extent cx="5989320" cy="3496016"/>
+            <wp:extent cx="5989320" cy="3393415"/>
             <wp:docPr id="12" name="Picture 12"/>
             <wp:cNvGraphicFramePr>
               <a:graphicFrameLocks noChangeAspect="1"/>
@@ -1212,7 +1212,7 @@
                   <pic:spPr>
                     <a:xfrm>
                       <a:off x="0" y="0"/>
-                      <a:ext cx="5989320" cy="3496016"/>
+                      <a:ext cx="5989320" cy="3393415"/>
                     </a:xfrm>
                     <a:prstGeom prst="rect"/>
                   </pic:spPr>
@@ -1289,7 +1289,7 @@
       <w:r>
         <w:drawing>
           <wp:inline xmlns:a="http://schemas.openxmlformats.org/drawingml/2006/main" xmlns:pic="http://schemas.openxmlformats.org/drawingml/2006/picture">
-            <wp:extent cx="5989320" cy="3496016"/>
+            <wp:extent cx="5989320" cy="3393415"/>
             <wp:docPr id="13" name="Picture 13"/>
             <wp:cNvGraphicFramePr>
               <a:graphicFrameLocks noChangeAspect="1"/>
@@ -1310,7 +1310,7 @@
                   <pic:spPr>
                     <a:xfrm>
                       <a:off x="0" y="0"/>
-                      <a:ext cx="5989320" cy="3496016"/>
+                      <a:ext cx="5989320" cy="3393415"/>
                     </a:xfrm>
                     <a:prstGeom prst="rect"/>
                   </pic:spPr>
@@ -1387,7 +1387,7 @@
       <w:r>
         <w:drawing>
           <wp:inline xmlns:a="http://schemas.openxmlformats.org/drawingml/2006/main" xmlns:pic="http://schemas.openxmlformats.org/drawingml/2006/picture">
-            <wp:extent cx="5989320" cy="3496016"/>
+            <wp:extent cx="5989320" cy="3393415"/>
             <wp:docPr id="14" name="Picture 14"/>
             <wp:cNvGraphicFramePr>
               <a:graphicFrameLocks noChangeAspect="1"/>
@@ -1408,7 +1408,7 @@
                   <pic:spPr>
                     <a:xfrm>
                       <a:off x="0" y="0"/>
-                      <a:ext cx="5989320" cy="3496016"/>
+                      <a:ext cx="5989320" cy="3393415"/>
                     </a:xfrm>
                     <a:prstGeom prst="rect"/>
                   </pic:spPr>
@@ -1485,7 +1485,7 @@
       <w:r>
         <w:drawing>
           <wp:inline xmlns:a="http://schemas.openxmlformats.org/drawingml/2006/main" xmlns:pic="http://schemas.openxmlformats.org/drawingml/2006/picture">
-            <wp:extent cx="5989320" cy="3496016"/>
+            <wp:extent cx="5989320" cy="3393415"/>
             <wp:docPr id="15" name="Picture 15"/>
             <wp:cNvGraphicFramePr>
               <a:graphicFrameLocks noChangeAspect="1"/>
@@ -1506,7 +1506,7 @@
                   <pic:spPr>
                     <a:xfrm>
                       <a:off x="0" y="0"/>
-                      <a:ext cx="5989320" cy="3496016"/>
+                      <a:ext cx="5989320" cy="3393415"/>
                     </a:xfrm>
                     <a:prstGeom prst="rect"/>
                   </pic:spPr>
@@ -1583,7 +1583,7 @@
       <w:r>
         <w:drawing>
           <wp:inline xmlns:a="http://schemas.openxmlformats.org/drawingml/2006/main" xmlns:pic="http://schemas.openxmlformats.org/drawingml/2006/picture">
-            <wp:extent cx="5989320" cy="3496016"/>
+            <wp:extent cx="5989320" cy="3393415"/>
             <wp:docPr id="16" name="Picture 16"/>
             <wp:cNvGraphicFramePr>
               <a:graphicFrameLocks noChangeAspect="1"/>
@@ -1604,7 +1604,7 @@
                   <pic:spPr>
                     <a:xfrm>
                       <a:off x="0" y="0"/>
-                      <a:ext cx="5989320" cy="3496016"/>
+                      <a:ext cx="5989320" cy="3393415"/>
                     </a:xfrm>
                     <a:prstGeom prst="rect"/>
                   </pic:spPr>
@@ -1681,7 +1681,7 @@
       <w:r>
         <w:drawing>
           <wp:inline xmlns:a="http://schemas.openxmlformats.org/drawingml/2006/main" xmlns:pic="http://schemas.openxmlformats.org/drawingml/2006/picture">
-            <wp:extent cx="5989320" cy="3496016"/>
+            <wp:extent cx="5989320" cy="3393415"/>
             <wp:docPr id="17" name="Picture 17"/>
             <wp:cNvGraphicFramePr>
               <a:graphicFrameLocks noChangeAspect="1"/>
@@ -1702,7 +1702,7 @@
                   <pic:spPr>
                     <a:xfrm>
                       <a:off x="0" y="0"/>
-                      <a:ext cx="5989320" cy="3496016"/>
+                      <a:ext cx="5989320" cy="3393415"/>
                     </a:xfrm>
                     <a:prstGeom prst="rect"/>
                   </pic:spPr>
@@ -1779,7 +1779,7 @@
       <w:r>
         <w:drawing>
           <wp:inline xmlns:a="http://schemas.openxmlformats.org/drawingml/2006/main" xmlns:pic="http://schemas.openxmlformats.org/drawingml/2006/picture">
-            <wp:extent cx="5989320" cy="3496016"/>
+            <wp:extent cx="5989320" cy="3393415"/>
             <wp:docPr id="18" name="Picture 18"/>
             <wp:cNvGraphicFramePr>
               <a:graphicFrameLocks noChangeAspect="1"/>
@@ -1800,7 +1800,7 @@
                   <pic:spPr>
                     <a:xfrm>
                       <a:off x="0" y="0"/>
-                      <a:ext cx="5989320" cy="3496016"/>
+                      <a:ext cx="5989320" cy="3393415"/>
                     </a:xfrm>
                     <a:prstGeom prst="rect"/>
                   </pic:spPr>
@@ -1877,7 +1877,7 @@
       <w:r>
         <w:drawing>
           <wp:inline xmlns:a="http://schemas.openxmlformats.org/drawingml/2006/main" xmlns:pic="http://schemas.openxmlformats.org/drawingml/2006/picture">
-            <wp:extent cx="5989320" cy="3496016"/>
+            <wp:extent cx="5989320" cy="3393415"/>
             <wp:docPr id="19" name="Picture 19"/>
             <wp:cNvGraphicFramePr>
               <a:graphicFrameLocks noChangeAspect="1"/>
@@ -1898,7 +1898,7 @@
                   <pic:spPr>
                     <a:xfrm>
                       <a:off x="0" y="0"/>
-                      <a:ext cx="5989320" cy="3496016"/>
+                      <a:ext cx="5989320" cy="3393415"/>
                     </a:xfrm>
                     <a:prstGeom prst="rect"/>
                   </pic:spPr>
@@ -1975,7 +1975,7 @@
       <w:r>
         <w:drawing>
           <wp:inline xmlns:a="http://schemas.openxmlformats.org/drawingml/2006/main" xmlns:pic="http://schemas.openxmlformats.org/drawingml/2006/picture">
-            <wp:extent cx="5989320" cy="3496016"/>
+            <wp:extent cx="5989320" cy="3393415"/>
             <wp:docPr id="20" name="Picture 20"/>
             <wp:cNvGraphicFramePr>
               <a:graphicFrameLocks noChangeAspect="1"/>
@@ -1996,7 +1996,7 @@
                   <pic:spPr>
                     <a:xfrm>
                       <a:off x="0" y="0"/>
-                      <a:ext cx="5989320" cy="3496016"/>
+                      <a:ext cx="5989320" cy="3393415"/>
                     </a:xfrm>
                     <a:prstGeom prst="rect"/>
                   </pic:spPr>

</xml_diff>